<commit_message>
Texto atualizado do TCC: novo resumo e abstract
</commit_message>
<xml_diff>
--- a/Texto Atualizado/TCC_Rafael_Diniz_Oliveira.docx
+++ b/Texto Atualizado/TCC_Rafael_Diniz_Oliveira.docx
@@ -357,7 +357,7 @@
         <w:ind w:firstLine="0"/>
       </w:pPr>
       <w:r>
-        <w:t xml:space="preserve">Este trabalho avalia se é possível investir apenas em empresas sustentáveis sem perder desempenho. Para isso, simula, de 2016 a 2025, carteiras de </w:t>
+        <w:t xml:space="preserve">Investir apenas em empresas sustentáveis costuma ser visto como uma escolha que cobra seu preço em retorno. Este trabalho coloca essa ideia à prova no mercado brasileiro. Com uma simulação histórica de 2016 a 2025, monta, a cada ano, carteiras de </w:t>
       </w:r>
       <w:r>
         <w:rPr>
@@ -366,11 +366,7 @@
         <w:t>factor investing</w:t>
       </w:r>
       <w:r>
-        <w:t xml:space="preserve"> formadas com as empresas do Índice de Sustentabilidade Empresarial da B3 (ISE B3) e compara o seu retorno e o seu risco com os do IBrX</w:t>
-      </w:r>
-      <w:r>
-        <w:noBreakHyphen/>
-        <w:t xml:space="preserve">100, índice das cem ações mais negociadas da B3, e com os do próprio ISE B3. As carteiras são refeitas uma vez por ano por quatro fatores, </w:t>
+        <w:t xml:space="preserve"> formadas com as empresas do Índice de Sustentabilidade Empresarial da B3 (ISE B3), escolhidas por </w:t>
       </w:r>
       <w:r>
         <w:rPr>
@@ -379,23 +375,15 @@
         <w:t>momentum</w:t>
       </w:r>
       <w:r>
-        <w:t>, baixa volatilidade, valor e qualidade, usados isoladamente e combinados de duas formas: a União, que junta as dez melhores ações de cada fator, e a Multifator, que escolhe as dez ações de melhor nota média nos quatro fatores. A simulação usa só as informações disponíveis na época e desconta custos de negociação, e o desempenho é medido pelo retorno, pela volatilidade, pela maior queda acumulada e pelo índice de Sharpe calculado com a taxa Selic. A Multifator rendeu 18,07% ao ano, contra 14,49% do IBrX</w:t>
+        <w:t>, baixa volatilidade, valor e qualidade, e compara o seu desempenho com o do IBrX</w:t>
       </w:r>
       <w:r>
         <w:noBreakHyphen/>
-        <w:t>100, com menos oscilação, menor queda máxima e índice de Sharpe maior, e foi a única carteira a terminar à frente do IBrX</w:t>
+        <w:t>100, que reúne as cem ações mais negociadas da bolsa, e com o do próprio ISE B3, considerando retorno, risco, custos de negociação e o comportamento nas três grandes crises do período. No período estudado, os resultados contrariam essa expectativa. Ficar só com empresas sustentáveis não teve custo, e a escolha por fatores dentro desse grupo levou a uma carteira que rendeu mais que o IBrX</w:t>
       </w:r>
       <w:r>
         <w:noBreakHyphen/>
-        <w:t>100 os três ciclos de queda e recuperação do período. A União praticamente empatou com o IBrX</w:t>
-      </w:r>
-      <w:r>
-        <w:noBreakHyphen/>
-        <w:t>100. O índice ISE B3 rendeu 7,34% ao ano, abaixo da Selic, mas a carteira com as mesmas empresas em pesos iguais acompanhou o IBrX</w:t>
-      </w:r>
-      <w:r>
-        <w:noBreakHyphen/>
-        <w:t>100, o que indica que o resultado fraco do índice veio da sua regra de peso, e não das empresas. Investir só em empresas sustentáveis não teve custo no período, e escolher bem dentro desse grupo rendeu mais e protegeu mais nas crises.</w:t>
+        <w:t>100, com menos risco, e que foi a única a atravessar as três crises à frente dele. Ao mesmo tempo, o índice de sustentabilidade da B3 rendeu menos que a própria taxa Selic, e o trabalho mostra que a causa está menos nas empresas que ele reúne do que na regra que define o peso de cada uma. Esses achados indicam que avaliar o investimento sustentável pelo índice da B3 pode subestimar o que as empresas sustentáveis entregam ao investidor.</w:t>
       </w:r>
     </w:p>
     <w:p>
@@ -442,27 +430,15 @@
         <w:ind w:firstLine="0"/>
       </w:pPr>
       <w:r>
-        <w:t>This study assesses whether it is possible to invest only in sustainable companies without losing performance. It simulates, from 2016 to 2025, factor investing portfolios formed with the companies of the B3 Corporate Sustainability Index (ISE B3) and compares their return and risk with those of the IBrX</w:t>
+        <w:t>Investing only in sustainable companies is often seen as a choice that costs returns. This study puts that idea to the test in the Brazilian market. Using a historical simulation from 2016 to 2025, it builds, each year, factor investing portfolios formed with the companies of the B3 Corporate Sustainability Index (ISE B3), selected by momentum, low volatility, value and quality, and compares their performance with that of the IBrX</w:t>
       </w:r>
       <w:r>
         <w:noBreakHyphen/>
-        <w:t>100, the index of the one hundred most traded stocks on B3, and with those of the ISE B3 itself. The portfolios are rebuilt once a year using four factors, momentum, low volatility, value and quality, used alone and combined in two ways: the União portfolio, which joins the ten best stocks of each factor, and the Multifator portfolio, which selects the ten stocks with the highest average score across the four factors. The simulation uses only the information available at the time and deducts trading costs, and performance is measured by return, volatility, maximum drawdown and the Sharpe ratio computed with the Selic rate. The Multifator portfolio returned 18.07% a year, against 14.49% for the IBrX</w:t>
+        <w:t>100, which gathers the one hundred most traded stocks on the exchange, and with that of the ISE B3 itself, considering return, risk, trading costs and behavior in the three major downturns of the period. In the period studied, the results run against that expectation. Restricting the portfolio to sustainable companies had no cost, and selecting by factors within this group led to a portfolio that returned more than the IBrX</w:t>
       </w:r>
       <w:r>
         <w:noBreakHyphen/>
-        <w:t>100, with lower volatility, a smaller maximum drawdown and a higher Sharpe ratio, and it was the only portfolio to end the three downturn and recovery cycles of the period ahead of the IBrX</w:t>
-      </w:r>
-      <w:r>
-        <w:noBreakHyphen/>
-        <w:t>100. The União portfolio was practically tied with the IBrX</w:t>
-      </w:r>
-      <w:r>
-        <w:noBreakHyphen/>
-        <w:t>100. The ISE B3 returned 7.34% a year, below the Selic rate, but a portfolio with the same companies in equal weights kept pace with the IBrX</w:t>
-      </w:r>
-      <w:r>
-        <w:noBreakHyphen/>
-        <w:t>100, which indicates that the index's weak result came from its weighting rule rather than from its companies. Investing only in sustainable companies had no cost in the period, and choosing well within this group delivered higher returns and more protection in crises.</w:t>
+        <w:t>100, with lower risk, and that was the only one to come through the three downturns ahead of it. At the same time, B3's sustainability index returned less than the Selic rate itself, and the study shows that the cause lies less in the companies it includes than in the rule that sets the weight of each one. These findings indicate that assessing sustainable investing through B3's index may underestimate what sustainable companies deliver to investors.</w:t>
       </w:r>
     </w:p>
     <w:p>
@@ -520,7 +496,7 @@
       <w:r>
         <w:fldChar w:fldCharType="separate"/>
       </w:r>
-      <w:hyperlink w:anchor="_Toc243324578" w:history="1">
+      <w:hyperlink w:anchor="_Toc243343629" w:history="1">
         <w:r>
           <w:rPr>
             <w:rStyle w:val="Hyperlink"/>
@@ -547,7 +523,7 @@
             <w:noProof/>
             <w:webHidden/>
           </w:rPr>
-          <w:instrText xml:space="preserve"> PAGEREF _Toc243324578 \h </w:instrText>
+          <w:instrText xml:space="preserve"> PAGEREF _Toc243343629 \h </w:instrText>
         </w:r>
         <w:r>
           <w:rPr>
@@ -595,7 +571,7 @@
           <w14:ligatures w14:val="standardContextual"/>
         </w:rPr>
       </w:pPr>
-      <w:hyperlink w:anchor="_Toc243324579" w:history="1">
+      <w:hyperlink w:anchor="_Toc243343630" w:history="1">
         <w:r>
           <w:rPr>
             <w:rStyle w:val="Hyperlink"/>
@@ -622,7 +598,7 @@
             <w:noProof/>
             <w:webHidden/>
           </w:rPr>
-          <w:instrText xml:space="preserve"> PAGEREF _Toc243324579 \h </w:instrText>
+          <w:instrText xml:space="preserve"> PAGEREF _Toc243343630 \h </w:instrText>
         </w:r>
         <w:r>
           <w:rPr>
@@ -670,7 +646,7 @@
           <w14:ligatures w14:val="standardContextual"/>
         </w:rPr>
       </w:pPr>
-      <w:hyperlink w:anchor="_Toc243324580" w:history="1">
+      <w:hyperlink w:anchor="_Toc243343631" w:history="1">
         <w:r>
           <w:rPr>
             <w:rStyle w:val="Hyperlink"/>
@@ -705,7 +681,7 @@
             <w:noProof/>
             <w:webHidden/>
           </w:rPr>
-          <w:instrText xml:space="preserve"> PAGEREF _Toc243324580 \h </w:instrText>
+          <w:instrText xml:space="preserve"> PAGEREF _Toc243343631 \h </w:instrText>
         </w:r>
         <w:r>
           <w:rPr>
@@ -780,7 +756,7 @@
       <w:r>
         <w:fldChar w:fldCharType="separate"/>
       </w:r>
-      <w:hyperlink w:anchor="_Toc243324581" w:history="1">
+      <w:hyperlink w:anchor="_Toc243343632" w:history="1">
         <w:r>
           <w:rPr>
             <w:rStyle w:val="Hyperlink"/>
@@ -807,7 +783,7 @@
             <w:noProof/>
             <w:webHidden/>
           </w:rPr>
-          <w:instrText xml:space="preserve"> PAGEREF _Toc243324581 \h </w:instrText>
+          <w:instrText xml:space="preserve"> PAGEREF _Toc243343632 \h </w:instrText>
         </w:r>
         <w:r>
           <w:rPr>
@@ -855,7 +831,7 @@
           <w14:ligatures w14:val="standardContextual"/>
         </w:rPr>
       </w:pPr>
-      <w:hyperlink w:anchor="_Toc243324582" w:history="1">
+      <w:hyperlink w:anchor="_Toc243343633" w:history="1">
         <w:r>
           <w:rPr>
             <w:rStyle w:val="Hyperlink"/>
@@ -882,7 +858,7 @@
             <w:noProof/>
             <w:webHidden/>
           </w:rPr>
-          <w:instrText xml:space="preserve"> PAGEREF _Toc243324582 \h </w:instrText>
+          <w:instrText xml:space="preserve"> PAGEREF _Toc243343633 \h </w:instrText>
         </w:r>
         <w:r>
           <w:rPr>
@@ -930,7 +906,7 @@
           <w14:ligatures w14:val="standardContextual"/>
         </w:rPr>
       </w:pPr>
-      <w:hyperlink w:anchor="_Toc243324583" w:history="1">
+      <w:hyperlink w:anchor="_Toc243343634" w:history="1">
         <w:r>
           <w:rPr>
             <w:rStyle w:val="Hyperlink"/>
@@ -957,7 +933,7 @@
             <w:noProof/>
             <w:webHidden/>
           </w:rPr>
-          <w:instrText xml:space="preserve"> PAGEREF _Toc243324583 \h </w:instrText>
+          <w:instrText xml:space="preserve"> PAGEREF _Toc243343634 \h </w:instrText>
         </w:r>
         <w:r>
           <w:rPr>
@@ -1005,7 +981,7 @@
           <w14:ligatures w14:val="standardContextual"/>
         </w:rPr>
       </w:pPr>
-      <w:hyperlink w:anchor="_Toc243324584" w:history="1">
+      <w:hyperlink w:anchor="_Toc243343635" w:history="1">
         <w:r>
           <w:rPr>
             <w:rStyle w:val="Hyperlink"/>
@@ -1040,7 +1016,7 @@
             <w:noProof/>
             <w:webHidden/>
           </w:rPr>
-          <w:instrText xml:space="preserve"> PAGEREF _Toc243324584 \h </w:instrText>
+          <w:instrText xml:space="preserve"> PAGEREF _Toc243343635 \h </w:instrText>
         </w:r>
         <w:r>
           <w:rPr>
@@ -1088,7 +1064,7 @@
           <w14:ligatures w14:val="standardContextual"/>
         </w:rPr>
       </w:pPr>
-      <w:hyperlink w:anchor="_Toc243324585" w:history="1">
+      <w:hyperlink w:anchor="_Toc243343636" w:history="1">
         <w:r>
           <w:rPr>
             <w:rStyle w:val="Hyperlink"/>
@@ -1115,7 +1091,7 @@
             <w:noProof/>
             <w:webHidden/>
           </w:rPr>
-          <w:instrText xml:space="preserve"> PAGEREF _Toc243324585 \h </w:instrText>
+          <w:instrText xml:space="preserve"> PAGEREF _Toc243343636 \h </w:instrText>
         </w:r>
         <w:r>
           <w:rPr>
@@ -1163,7 +1139,7 @@
           <w14:ligatures w14:val="standardContextual"/>
         </w:rPr>
       </w:pPr>
-      <w:hyperlink w:anchor="_Toc243324586" w:history="1">
+      <w:hyperlink w:anchor="_Toc243343637" w:history="1">
         <w:r>
           <w:rPr>
             <w:rStyle w:val="Hyperlink"/>
@@ -1190,7 +1166,7 @@
             <w:noProof/>
             <w:webHidden/>
           </w:rPr>
-          <w:instrText xml:space="preserve"> PAGEREF _Toc243324586 \h </w:instrText>
+          <w:instrText xml:space="preserve"> PAGEREF _Toc243343637 \h </w:instrText>
         </w:r>
         <w:r>
           <w:rPr>
@@ -1238,7 +1214,7 @@
           <w14:ligatures w14:val="standardContextual"/>
         </w:rPr>
       </w:pPr>
-      <w:hyperlink w:anchor="_Toc243324587" w:history="1">
+      <w:hyperlink w:anchor="_Toc243343638" w:history="1">
         <w:r>
           <w:rPr>
             <w:rStyle w:val="Hyperlink"/>
@@ -1273,7 +1249,7 @@
             <w:noProof/>
             <w:webHidden/>
           </w:rPr>
-          <w:instrText xml:space="preserve"> PAGEREF _Toc243324587 \h </w:instrText>
+          <w:instrText xml:space="preserve"> PAGEREF _Toc243343638 \h </w:instrText>
         </w:r>
         <w:r>
           <w:rPr>
@@ -1321,7 +1297,7 @@
           <w14:ligatures w14:val="standardContextual"/>
         </w:rPr>
       </w:pPr>
-      <w:hyperlink w:anchor="_Toc243324588" w:history="1">
+      <w:hyperlink w:anchor="_Toc243343639" w:history="1">
         <w:r>
           <w:rPr>
             <w:rStyle w:val="Hyperlink"/>
@@ -1356,7 +1332,7 @@
             <w:noProof/>
             <w:webHidden/>
           </w:rPr>
-          <w:instrText xml:space="preserve"> PAGEREF _Toc243324588 \h </w:instrText>
+          <w:instrText xml:space="preserve"> PAGEREF _Toc243343639 \h </w:instrText>
         </w:r>
         <w:r>
           <w:rPr>
@@ -1404,7 +1380,7 @@
           <w14:ligatures w14:val="standardContextual"/>
         </w:rPr>
       </w:pPr>
-      <w:hyperlink w:anchor="_Toc243324589" w:history="1">
+      <w:hyperlink w:anchor="_Toc243343640" w:history="1">
         <w:r>
           <w:rPr>
             <w:rStyle w:val="Hyperlink"/>
@@ -1439,7 +1415,7 @@
             <w:noProof/>
             <w:webHidden/>
           </w:rPr>
-          <w:instrText xml:space="preserve"> PAGEREF _Toc243324589 \h </w:instrText>
+          <w:instrText xml:space="preserve"> PAGEREF _Toc243343640 \h </w:instrText>
         </w:r>
         <w:r>
           <w:rPr>
@@ -1514,7 +1490,7 @@
       <w:r>
         <w:fldChar w:fldCharType="separate"/>
       </w:r>
-      <w:hyperlink w:anchor="_Toc243324590" w:history="1">
+      <w:hyperlink w:anchor="_Toc243343641" w:history="1">
         <w:r>
           <w:rPr>
             <w:rStyle w:val="Hyperlink"/>
@@ -1549,7 +1525,7 @@
             <w:noProof/>
             <w:webHidden/>
           </w:rPr>
-          <w:instrText xml:space="preserve"> PAGEREF _Toc243324590 \h </w:instrText>
+          <w:instrText xml:space="preserve"> PAGEREF _Toc243343641 \h </w:instrText>
         </w:r>
         <w:r>
           <w:rPr>
@@ -1597,7 +1573,7 @@
           <w14:ligatures w14:val="standardContextual"/>
         </w:rPr>
       </w:pPr>
-      <w:hyperlink w:anchor="_Toc243324591" w:history="1">
+      <w:hyperlink w:anchor="_Toc243343642" w:history="1">
         <w:r>
           <w:rPr>
             <w:rStyle w:val="Hyperlink"/>
@@ -1624,7 +1600,7 @@
             <w:noProof/>
             <w:webHidden/>
           </w:rPr>
-          <w:instrText xml:space="preserve"> PAGEREF _Toc243324591 \h </w:instrText>
+          <w:instrText xml:space="preserve"> PAGEREF _Toc243343642 \h </w:instrText>
         </w:r>
         <w:r>
           <w:rPr>
@@ -1672,7 +1648,7 @@
           <w14:ligatures w14:val="standardContextual"/>
         </w:rPr>
       </w:pPr>
-      <w:hyperlink w:anchor="_Toc243324592" w:history="1">
+      <w:hyperlink w:anchor="_Toc243343643" w:history="1">
         <w:r>
           <w:rPr>
             <w:rStyle w:val="Hyperlink"/>
@@ -1699,7 +1675,7 @@
             <w:noProof/>
             <w:webHidden/>
           </w:rPr>
-          <w:instrText xml:space="preserve"> PAGEREF _Toc243324592 \h </w:instrText>
+          <w:instrText xml:space="preserve"> PAGEREF _Toc243343643 \h </w:instrText>
         </w:r>
         <w:r>
           <w:rPr>
@@ -1747,7 +1723,7 @@
           <w14:ligatures w14:val="standardContextual"/>
         </w:rPr>
       </w:pPr>
-      <w:hyperlink w:anchor="_Toc243324593" w:history="1">
+      <w:hyperlink w:anchor="_Toc243343644" w:history="1">
         <w:r>
           <w:rPr>
             <w:rStyle w:val="Hyperlink"/>
@@ -1774,7 +1750,7 @@
             <w:noProof/>
             <w:webHidden/>
           </w:rPr>
-          <w:instrText xml:space="preserve"> PAGEREF _Toc243324593 \h </w:instrText>
+          <w:instrText xml:space="preserve"> PAGEREF _Toc243343644 \h </w:instrText>
         </w:r>
         <w:r>
           <w:rPr>
@@ -1822,7 +1798,7 @@
           <w14:ligatures w14:val="standardContextual"/>
         </w:rPr>
       </w:pPr>
-      <w:hyperlink w:anchor="_Toc243324594" w:history="1">
+      <w:hyperlink w:anchor="_Toc243343645" w:history="1">
         <w:r>
           <w:rPr>
             <w:rStyle w:val="Hyperlink"/>
@@ -1849,7 +1825,7 @@
             <w:noProof/>
             <w:webHidden/>
           </w:rPr>
-          <w:instrText xml:space="preserve"> PAGEREF _Toc243324594 \h </w:instrText>
+          <w:instrText xml:space="preserve"> PAGEREF _Toc243343645 \h </w:instrText>
         </w:r>
         <w:r>
           <w:rPr>
@@ -1897,7 +1873,7 @@
           <w14:ligatures w14:val="standardContextual"/>
         </w:rPr>
       </w:pPr>
-      <w:hyperlink w:anchor="_Toc243324595" w:history="1">
+      <w:hyperlink w:anchor="_Toc243343646" w:history="1">
         <w:r>
           <w:rPr>
             <w:rStyle w:val="Hyperlink"/>
@@ -1924,7 +1900,7 @@
             <w:noProof/>
             <w:webHidden/>
           </w:rPr>
-          <w:instrText xml:space="preserve"> PAGEREF _Toc243324595 \h </w:instrText>
+          <w:instrText xml:space="preserve"> PAGEREF _Toc243343646 \h </w:instrText>
         </w:r>
         <w:r>
           <w:rPr>
@@ -1972,7 +1948,7 @@
           <w14:ligatures w14:val="standardContextual"/>
         </w:rPr>
       </w:pPr>
-      <w:hyperlink w:anchor="_Toc243324596" w:history="1">
+      <w:hyperlink w:anchor="_Toc243343647" w:history="1">
         <w:r>
           <w:rPr>
             <w:rStyle w:val="Hyperlink"/>
@@ -1999,7 +1975,7 @@
             <w:noProof/>
             <w:webHidden/>
           </w:rPr>
-          <w:instrText xml:space="preserve"> PAGEREF _Toc243324596 \h </w:instrText>
+          <w:instrText xml:space="preserve"> PAGEREF _Toc243343647 \h </w:instrText>
         </w:r>
         <w:r>
           <w:rPr>
@@ -2047,7 +2023,7 @@
           <w14:ligatures w14:val="standardContextual"/>
         </w:rPr>
       </w:pPr>
-      <w:hyperlink w:anchor="_Toc243324597" w:history="1">
+      <w:hyperlink w:anchor="_Toc243343648" w:history="1">
         <w:r>
           <w:rPr>
             <w:rStyle w:val="Hyperlink"/>
@@ -2074,7 +2050,7 @@
             <w:noProof/>
             <w:webHidden/>
           </w:rPr>
-          <w:instrText xml:space="preserve"> PAGEREF _Toc243324597 \h </w:instrText>
+          <w:instrText xml:space="preserve"> PAGEREF _Toc243343648 \h </w:instrText>
         </w:r>
         <w:r>
           <w:rPr>
@@ -2122,7 +2098,7 @@
           <w14:ligatures w14:val="standardContextual"/>
         </w:rPr>
       </w:pPr>
-      <w:hyperlink w:anchor="_Toc243324598" w:history="1">
+      <w:hyperlink w:anchor="_Toc243343649" w:history="1">
         <w:r>
           <w:rPr>
             <w:rStyle w:val="Hyperlink"/>
@@ -2164,7 +2140,7 @@
             <w:noProof/>
             <w:webHidden/>
           </w:rPr>
-          <w:instrText xml:space="preserve"> PAGEREF _Toc243324598 \h </w:instrText>
+          <w:instrText xml:space="preserve"> PAGEREF _Toc243343649 \h </w:instrText>
         </w:r>
         <w:r>
           <w:rPr>
@@ -2212,7 +2188,7 @@
           <w14:ligatures w14:val="standardContextual"/>
         </w:rPr>
       </w:pPr>
-      <w:hyperlink w:anchor="_Toc243324599" w:history="1">
+      <w:hyperlink w:anchor="_Toc243343650" w:history="1">
         <w:r>
           <w:rPr>
             <w:rStyle w:val="Hyperlink"/>
@@ -2239,7 +2215,7 @@
             <w:noProof/>
             <w:webHidden/>
           </w:rPr>
-          <w:instrText xml:space="preserve"> PAGEREF _Toc243324599 \h </w:instrText>
+          <w:instrText xml:space="preserve"> PAGEREF _Toc243343650 \h </w:instrText>
         </w:r>
         <w:r>
           <w:rPr>
@@ -2436,7 +2412,7 @@
       <w:r>
         <w:fldChar w:fldCharType="separate"/>
       </w:r>
-      <w:hyperlink w:anchor="_Toc243324547" w:history="1">
+      <w:hyperlink w:anchor="_Toc243343598" w:history="1">
         <w:r>
           <w:rPr>
             <w:rStyle w:val="Hyperlink"/>
@@ -2463,7 +2439,7 @@
             <w:noProof/>
             <w:webHidden/>
           </w:rPr>
-          <w:instrText xml:space="preserve"> PAGEREF _Toc243324547 \h </w:instrText>
+          <w:instrText xml:space="preserve"> PAGEREF _Toc243343598 \h </w:instrText>
         </w:r>
         <w:r>
           <w:rPr>
@@ -2511,7 +2487,7 @@
           <w14:ligatures w14:val="standardContextual"/>
         </w:rPr>
       </w:pPr>
-      <w:hyperlink w:anchor="_Toc243324548" w:history="1">
+      <w:hyperlink w:anchor="_Toc243343599" w:history="1">
         <w:r>
           <w:rPr>
             <w:rStyle w:val="Hyperlink"/>
@@ -2538,7 +2514,7 @@
             <w:noProof/>
             <w:webHidden/>
           </w:rPr>
-          <w:instrText xml:space="preserve"> PAGEREF _Toc243324548 \h </w:instrText>
+          <w:instrText xml:space="preserve"> PAGEREF _Toc243343599 \h </w:instrText>
         </w:r>
         <w:r>
           <w:rPr>
@@ -2586,7 +2562,7 @@
           <w14:ligatures w14:val="standardContextual"/>
         </w:rPr>
       </w:pPr>
-      <w:hyperlink w:anchor="_Toc243324549" w:history="1">
+      <w:hyperlink w:anchor="_Toc243343600" w:history="1">
         <w:r>
           <w:rPr>
             <w:rStyle w:val="Hyperlink"/>
@@ -2613,7 +2589,7 @@
             <w:noProof/>
             <w:webHidden/>
           </w:rPr>
-          <w:instrText xml:space="preserve"> PAGEREF _Toc243324549 \h </w:instrText>
+          <w:instrText xml:space="preserve"> PAGEREF _Toc243343600 \h </w:instrText>
         </w:r>
         <w:r>
           <w:rPr>
@@ -2661,7 +2637,7 @@
           <w14:ligatures w14:val="standardContextual"/>
         </w:rPr>
       </w:pPr>
-      <w:hyperlink w:anchor="_Toc243324550" w:history="1">
+      <w:hyperlink w:anchor="_Toc243343601" w:history="1">
         <w:r>
           <w:rPr>
             <w:rStyle w:val="Hyperlink"/>
@@ -2688,7 +2664,7 @@
             <w:noProof/>
             <w:webHidden/>
           </w:rPr>
-          <w:instrText xml:space="preserve"> PAGEREF _Toc243324550 \h </w:instrText>
+          <w:instrText xml:space="preserve"> PAGEREF _Toc243343601 \h </w:instrText>
         </w:r>
         <w:r>
           <w:rPr>
@@ -2736,7 +2712,7 @@
           <w14:ligatures w14:val="standardContextual"/>
         </w:rPr>
       </w:pPr>
-      <w:hyperlink w:anchor="_Toc243324551" w:history="1">
+      <w:hyperlink w:anchor="_Toc243343602" w:history="1">
         <w:r>
           <w:rPr>
             <w:rStyle w:val="Hyperlink"/>
@@ -2763,7 +2739,7 @@
             <w:noProof/>
             <w:webHidden/>
           </w:rPr>
-          <w:instrText xml:space="preserve"> PAGEREF _Toc243324551 \h </w:instrText>
+          <w:instrText xml:space="preserve"> PAGEREF _Toc243343602 \h </w:instrText>
         </w:r>
         <w:r>
           <w:rPr>
@@ -2811,7 +2787,7 @@
           <w14:ligatures w14:val="standardContextual"/>
         </w:rPr>
       </w:pPr>
-      <w:hyperlink w:anchor="_Toc243324552" w:history="1">
+      <w:hyperlink w:anchor="_Toc243343603" w:history="1">
         <w:r>
           <w:rPr>
             <w:rStyle w:val="Hyperlink"/>
@@ -2846,7 +2822,7 @@
             <w:noProof/>
             <w:webHidden/>
           </w:rPr>
-          <w:instrText xml:space="preserve"> PAGEREF _Toc243324552 \h </w:instrText>
+          <w:instrText xml:space="preserve"> PAGEREF _Toc243343603 \h </w:instrText>
         </w:r>
         <w:r>
           <w:rPr>
@@ -2894,7 +2870,7 @@
           <w14:ligatures w14:val="standardContextual"/>
         </w:rPr>
       </w:pPr>
-      <w:hyperlink w:anchor="_Toc243324553" w:history="1">
+      <w:hyperlink w:anchor="_Toc243343604" w:history="1">
         <w:r>
           <w:rPr>
             <w:rStyle w:val="Hyperlink"/>
@@ -2921,7 +2897,7 @@
             <w:noProof/>
             <w:webHidden/>
           </w:rPr>
-          <w:instrText xml:space="preserve"> PAGEREF _Toc243324553 \h </w:instrText>
+          <w:instrText xml:space="preserve"> PAGEREF _Toc243343604 \h </w:instrText>
         </w:r>
         <w:r>
           <w:rPr>
@@ -2969,7 +2945,7 @@
           <w14:ligatures w14:val="standardContextual"/>
         </w:rPr>
       </w:pPr>
-      <w:hyperlink w:anchor="_Toc243324554" w:history="1">
+      <w:hyperlink w:anchor="_Toc243343605" w:history="1">
         <w:r>
           <w:rPr>
             <w:rStyle w:val="Hyperlink"/>
@@ -2996,7 +2972,7 @@
             <w:noProof/>
             <w:webHidden/>
           </w:rPr>
-          <w:instrText xml:space="preserve"> PAGEREF _Toc243324554 \h </w:instrText>
+          <w:instrText xml:space="preserve"> PAGEREF _Toc243343605 \h </w:instrText>
         </w:r>
         <w:r>
           <w:rPr>
@@ -3044,7 +3020,7 @@
           <w14:ligatures w14:val="standardContextual"/>
         </w:rPr>
       </w:pPr>
-      <w:hyperlink w:anchor="_Toc243324555" w:history="1">
+      <w:hyperlink w:anchor="_Toc243343606" w:history="1">
         <w:r>
           <w:rPr>
             <w:rStyle w:val="Hyperlink"/>
@@ -3071,7 +3047,7 @@
             <w:noProof/>
             <w:webHidden/>
           </w:rPr>
-          <w:instrText xml:space="preserve"> PAGEREF _Toc243324555 \h </w:instrText>
+          <w:instrText xml:space="preserve"> PAGEREF _Toc243343606 \h </w:instrText>
         </w:r>
         <w:r>
           <w:rPr>
@@ -3119,7 +3095,7 @@
           <w14:ligatures w14:val="standardContextual"/>
         </w:rPr>
       </w:pPr>
-      <w:hyperlink w:anchor="_Toc243324556" w:history="1">
+      <w:hyperlink w:anchor="_Toc243343607" w:history="1">
         <w:r>
           <w:rPr>
             <w:rStyle w:val="Hyperlink"/>
@@ -3146,7 +3122,7 @@
             <w:noProof/>
             <w:webHidden/>
           </w:rPr>
-          <w:instrText xml:space="preserve"> PAGEREF _Toc243324556 \h </w:instrText>
+          <w:instrText xml:space="preserve"> PAGEREF _Toc243343607 \h </w:instrText>
         </w:r>
         <w:r>
           <w:rPr>
@@ -3194,7 +3170,7 @@
           <w14:ligatures w14:val="standardContextual"/>
         </w:rPr>
       </w:pPr>
-      <w:hyperlink w:anchor="_Toc243324557" w:history="1">
+      <w:hyperlink w:anchor="_Toc243343608" w:history="1">
         <w:r>
           <w:rPr>
             <w:rStyle w:val="Hyperlink"/>
@@ -3221,7 +3197,7 @@
             <w:noProof/>
             <w:webHidden/>
           </w:rPr>
-          <w:instrText xml:space="preserve"> PAGEREF _Toc243324557 \h </w:instrText>
+          <w:instrText xml:space="preserve"> PAGEREF _Toc243343608 \h </w:instrText>
         </w:r>
         <w:r>
           <w:rPr>
@@ -3269,7 +3245,7 @@
           <w14:ligatures w14:val="standardContextual"/>
         </w:rPr>
       </w:pPr>
-      <w:hyperlink w:anchor="_Toc243324558" w:history="1">
+      <w:hyperlink w:anchor="_Toc243343609" w:history="1">
         <w:r>
           <w:rPr>
             <w:rStyle w:val="Hyperlink"/>
@@ -3296,7 +3272,7 @@
             <w:noProof/>
             <w:webHidden/>
           </w:rPr>
-          <w:instrText xml:space="preserve"> PAGEREF _Toc243324558 \h </w:instrText>
+          <w:instrText xml:space="preserve"> PAGEREF _Toc243343609 \h </w:instrText>
         </w:r>
         <w:r>
           <w:rPr>
@@ -3344,7 +3320,7 @@
           <w14:ligatures w14:val="standardContextual"/>
         </w:rPr>
       </w:pPr>
-      <w:hyperlink w:anchor="_Toc243324559" w:history="1">
+      <w:hyperlink w:anchor="_Toc243343610" w:history="1">
         <w:r>
           <w:rPr>
             <w:rStyle w:val="Hyperlink"/>
@@ -3371,7 +3347,7 @@
             <w:noProof/>
             <w:webHidden/>
           </w:rPr>
-          <w:instrText xml:space="preserve"> PAGEREF _Toc243324559 \h </w:instrText>
+          <w:instrText xml:space="preserve"> PAGEREF _Toc243343610 \h </w:instrText>
         </w:r>
         <w:r>
           <w:rPr>
@@ -3419,7 +3395,7 @@
           <w14:ligatures w14:val="standardContextual"/>
         </w:rPr>
       </w:pPr>
-      <w:hyperlink w:anchor="_Toc243324560" w:history="1">
+      <w:hyperlink w:anchor="_Toc243343611" w:history="1">
         <w:r>
           <w:rPr>
             <w:rStyle w:val="Hyperlink"/>
@@ -3446,7 +3422,7 @@
             <w:noProof/>
             <w:webHidden/>
           </w:rPr>
-          <w:instrText xml:space="preserve"> PAGEREF _Toc243324560 \h </w:instrText>
+          <w:instrText xml:space="preserve"> PAGEREF _Toc243343611 \h </w:instrText>
         </w:r>
         <w:r>
           <w:rPr>
@@ -3494,7 +3470,7 @@
           <w14:ligatures w14:val="standardContextual"/>
         </w:rPr>
       </w:pPr>
-      <w:hyperlink w:anchor="_Toc243324561" w:history="1">
+      <w:hyperlink w:anchor="_Toc243343612" w:history="1">
         <w:r>
           <w:rPr>
             <w:rStyle w:val="Hyperlink"/>
@@ -3521,7 +3497,7 @@
             <w:noProof/>
             <w:webHidden/>
           </w:rPr>
-          <w:instrText xml:space="preserve"> PAGEREF _Toc243324561 \h </w:instrText>
+          <w:instrText xml:space="preserve"> PAGEREF _Toc243343612 \h </w:instrText>
         </w:r>
         <w:r>
           <w:rPr>
@@ -3569,7 +3545,7 @@
           <w14:ligatures w14:val="standardContextual"/>
         </w:rPr>
       </w:pPr>
-      <w:hyperlink w:anchor="_Toc243324562" w:history="1">
+      <w:hyperlink w:anchor="_Toc243343613" w:history="1">
         <w:r>
           <w:rPr>
             <w:rStyle w:val="Hyperlink"/>
@@ -3596,7 +3572,7 @@
             <w:noProof/>
             <w:webHidden/>
           </w:rPr>
-          <w:instrText xml:space="preserve"> PAGEREF _Toc243324562 \h </w:instrText>
+          <w:instrText xml:space="preserve"> PAGEREF _Toc243343613 \h </w:instrText>
         </w:r>
         <w:r>
           <w:rPr>
@@ -3644,7 +3620,7 @@
           <w14:ligatures w14:val="standardContextual"/>
         </w:rPr>
       </w:pPr>
-      <w:hyperlink w:anchor="_Toc243324563" w:history="1">
+      <w:hyperlink w:anchor="_Toc243343614" w:history="1">
         <w:r>
           <w:rPr>
             <w:rStyle w:val="Hyperlink"/>
@@ -3671,7 +3647,7 @@
             <w:noProof/>
             <w:webHidden/>
           </w:rPr>
-          <w:instrText xml:space="preserve"> PAGEREF _Toc243324563 \h </w:instrText>
+          <w:instrText xml:space="preserve"> PAGEREF _Toc243343614 \h </w:instrText>
         </w:r>
         <w:r>
           <w:rPr>
@@ -3719,7 +3695,7 @@
           <w14:ligatures w14:val="standardContextual"/>
         </w:rPr>
       </w:pPr>
-      <w:hyperlink w:anchor="_Toc243324564" w:history="1">
+      <w:hyperlink w:anchor="_Toc243343615" w:history="1">
         <w:r>
           <w:rPr>
             <w:rStyle w:val="Hyperlink"/>
@@ -3746,7 +3722,7 @@
             <w:noProof/>
             <w:webHidden/>
           </w:rPr>
-          <w:instrText xml:space="preserve"> PAGEREF _Toc243324564 \h </w:instrText>
+          <w:instrText xml:space="preserve"> PAGEREF _Toc243343615 \h </w:instrText>
         </w:r>
         <w:r>
           <w:rPr>
@@ -3794,7 +3770,7 @@
           <w14:ligatures w14:val="standardContextual"/>
         </w:rPr>
       </w:pPr>
-      <w:hyperlink w:anchor="_Toc243324565" w:history="1">
+      <w:hyperlink w:anchor="_Toc243343616" w:history="1">
         <w:r>
           <w:rPr>
             <w:rStyle w:val="Hyperlink"/>
@@ -3821,7 +3797,7 @@
             <w:noProof/>
             <w:webHidden/>
           </w:rPr>
-          <w:instrText xml:space="preserve"> PAGEREF _Toc243324565 \h </w:instrText>
+          <w:instrText xml:space="preserve"> PAGEREF _Toc243343616 \h </w:instrText>
         </w:r>
         <w:r>
           <w:rPr>
@@ -3869,7 +3845,7 @@
           <w14:ligatures w14:val="standardContextual"/>
         </w:rPr>
       </w:pPr>
-      <w:hyperlink w:anchor="_Toc243324566" w:history="1">
+      <w:hyperlink w:anchor="_Toc243343617" w:history="1">
         <w:r>
           <w:rPr>
             <w:rStyle w:val="Hyperlink"/>
@@ -3896,7 +3872,7 @@
             <w:noProof/>
             <w:webHidden/>
           </w:rPr>
-          <w:instrText xml:space="preserve"> PAGEREF _Toc243324566 \h </w:instrText>
+          <w:instrText xml:space="preserve"> PAGEREF _Toc243343617 \h </w:instrText>
         </w:r>
         <w:r>
           <w:rPr>
@@ -3944,7 +3920,7 @@
           <w14:ligatures w14:val="standardContextual"/>
         </w:rPr>
       </w:pPr>
-      <w:hyperlink w:anchor="_Toc243324567" w:history="1">
+      <w:hyperlink w:anchor="_Toc243343618" w:history="1">
         <w:r>
           <w:rPr>
             <w:rStyle w:val="Hyperlink"/>
@@ -3971,7 +3947,7 @@
             <w:noProof/>
             <w:webHidden/>
           </w:rPr>
-          <w:instrText xml:space="preserve"> PAGEREF _Toc243324567 \h </w:instrText>
+          <w:instrText xml:space="preserve"> PAGEREF _Toc243343618 \h </w:instrText>
         </w:r>
         <w:r>
           <w:rPr>
@@ -4019,7 +3995,7 @@
           <w14:ligatures w14:val="standardContextual"/>
         </w:rPr>
       </w:pPr>
-      <w:hyperlink w:anchor="_Toc243324568" w:history="1">
+      <w:hyperlink w:anchor="_Toc243343619" w:history="1">
         <w:r>
           <w:rPr>
             <w:rStyle w:val="Hyperlink"/>
@@ -4046,7 +4022,7 @@
             <w:noProof/>
             <w:webHidden/>
           </w:rPr>
-          <w:instrText xml:space="preserve"> PAGEREF _Toc243324568 \h </w:instrText>
+          <w:instrText xml:space="preserve"> PAGEREF _Toc243343619 \h </w:instrText>
         </w:r>
         <w:r>
           <w:rPr>
@@ -4094,7 +4070,7 @@
           <w14:ligatures w14:val="standardContextual"/>
         </w:rPr>
       </w:pPr>
-      <w:hyperlink w:anchor="_Toc243324569" w:history="1">
+      <w:hyperlink w:anchor="_Toc243343620" w:history="1">
         <w:r>
           <w:rPr>
             <w:rStyle w:val="Hyperlink"/>
@@ -4121,7 +4097,7 @@
             <w:noProof/>
             <w:webHidden/>
           </w:rPr>
-          <w:instrText xml:space="preserve"> PAGEREF _Toc243324569 \h </w:instrText>
+          <w:instrText xml:space="preserve"> PAGEREF _Toc243343620 \h </w:instrText>
         </w:r>
         <w:r>
           <w:rPr>
@@ -4169,7 +4145,7 @@
           <w14:ligatures w14:val="standardContextual"/>
         </w:rPr>
       </w:pPr>
-      <w:hyperlink w:anchor="_Toc243324570" w:history="1">
+      <w:hyperlink w:anchor="_Toc243343621" w:history="1">
         <w:r>
           <w:rPr>
             <w:rStyle w:val="Hyperlink"/>
@@ -4196,7 +4172,7 @@
             <w:noProof/>
             <w:webHidden/>
           </w:rPr>
-          <w:instrText xml:space="preserve"> PAGEREF _Toc243324570 \h </w:instrText>
+          <w:instrText xml:space="preserve"> PAGEREF _Toc243343621 \h </w:instrText>
         </w:r>
         <w:r>
           <w:rPr>
@@ -4244,7 +4220,7 @@
           <w14:ligatures w14:val="standardContextual"/>
         </w:rPr>
       </w:pPr>
-      <w:hyperlink w:anchor="_Toc243324571" w:history="1">
+      <w:hyperlink w:anchor="_Toc243343622" w:history="1">
         <w:r>
           <w:rPr>
             <w:rStyle w:val="Hyperlink"/>
@@ -4271,7 +4247,7 @@
             <w:noProof/>
             <w:webHidden/>
           </w:rPr>
-          <w:instrText xml:space="preserve"> PAGEREF _Toc243324571 \h </w:instrText>
+          <w:instrText xml:space="preserve"> PAGEREF _Toc243343622 \h </w:instrText>
         </w:r>
         <w:r>
           <w:rPr>
@@ -4319,7 +4295,7 @@
           <w14:ligatures w14:val="standardContextual"/>
         </w:rPr>
       </w:pPr>
-      <w:hyperlink w:anchor="_Toc243324572" w:history="1">
+      <w:hyperlink w:anchor="_Toc243343623" w:history="1">
         <w:r>
           <w:rPr>
             <w:rStyle w:val="Hyperlink"/>
@@ -4346,7 +4322,7 @@
             <w:noProof/>
             <w:webHidden/>
           </w:rPr>
-          <w:instrText xml:space="preserve"> PAGEREF _Toc243324572 \h </w:instrText>
+          <w:instrText xml:space="preserve"> PAGEREF _Toc243343623 \h </w:instrText>
         </w:r>
         <w:r>
           <w:rPr>
@@ -4394,7 +4370,7 @@
           <w14:ligatures w14:val="standardContextual"/>
         </w:rPr>
       </w:pPr>
-      <w:hyperlink w:anchor="_Toc243324573" w:history="1">
+      <w:hyperlink w:anchor="_Toc243343624" w:history="1">
         <w:r>
           <w:rPr>
             <w:rStyle w:val="Hyperlink"/>
@@ -4421,7 +4397,7 @@
             <w:noProof/>
             <w:webHidden/>
           </w:rPr>
-          <w:instrText xml:space="preserve"> PAGEREF _Toc243324573 \h </w:instrText>
+          <w:instrText xml:space="preserve"> PAGEREF _Toc243343624 \h </w:instrText>
         </w:r>
         <w:r>
           <w:rPr>
@@ -4469,7 +4445,7 @@
           <w14:ligatures w14:val="standardContextual"/>
         </w:rPr>
       </w:pPr>
-      <w:hyperlink w:anchor="_Toc243324574" w:history="1">
+      <w:hyperlink w:anchor="_Toc243343625" w:history="1">
         <w:r>
           <w:rPr>
             <w:rStyle w:val="Hyperlink"/>
@@ -4496,7 +4472,7 @@
             <w:noProof/>
             <w:webHidden/>
           </w:rPr>
-          <w:instrText xml:space="preserve"> PAGEREF _Toc243324574 \h </w:instrText>
+          <w:instrText xml:space="preserve"> PAGEREF _Toc243343625 \h </w:instrText>
         </w:r>
         <w:r>
           <w:rPr>
@@ -4544,7 +4520,7 @@
           <w14:ligatures w14:val="standardContextual"/>
         </w:rPr>
       </w:pPr>
-      <w:hyperlink w:anchor="_Toc243324575" w:history="1">
+      <w:hyperlink w:anchor="_Toc243343626" w:history="1">
         <w:r>
           <w:rPr>
             <w:rStyle w:val="Hyperlink"/>
@@ -4571,7 +4547,7 @@
             <w:noProof/>
             <w:webHidden/>
           </w:rPr>
-          <w:instrText xml:space="preserve"> PAGEREF _Toc243324575 \h </w:instrText>
+          <w:instrText xml:space="preserve"> PAGEREF _Toc243343626 \h </w:instrText>
         </w:r>
         <w:r>
           <w:rPr>
@@ -4619,7 +4595,7 @@
           <w14:ligatures w14:val="standardContextual"/>
         </w:rPr>
       </w:pPr>
-      <w:hyperlink w:anchor="_Toc243324576" w:history="1">
+      <w:hyperlink w:anchor="_Toc243343627" w:history="1">
         <w:r>
           <w:rPr>
             <w:rStyle w:val="Hyperlink"/>
@@ -4646,7 +4622,7 @@
             <w:noProof/>
             <w:webHidden/>
           </w:rPr>
-          <w:instrText xml:space="preserve"> PAGEREF _Toc243324576 \h </w:instrText>
+          <w:instrText xml:space="preserve"> PAGEREF _Toc243343627 \h </w:instrText>
         </w:r>
         <w:r>
           <w:rPr>
@@ -4694,7 +4670,7 @@
           <w14:ligatures w14:val="standardContextual"/>
         </w:rPr>
       </w:pPr>
-      <w:hyperlink w:anchor="_Toc243324577" w:history="1">
+      <w:hyperlink w:anchor="_Toc243343628" w:history="1">
         <w:r>
           <w:rPr>
             <w:rStyle w:val="Hyperlink"/>
@@ -4721,7 +4697,7 @@
             <w:noProof/>
             <w:webHidden/>
           </w:rPr>
-          <w:instrText xml:space="preserve"> PAGEREF _Toc243324577 \h </w:instrText>
+          <w:instrText xml:space="preserve"> PAGEREF _Toc243343628 \h </w:instrText>
         </w:r>
         <w:r>
           <w:rPr>
@@ -4769,6 +4745,10 @@
     </w:p>
     <w:p>
       <w:pPr>
+        <w:spacing w:line="20" w:lineRule="exact"/>
+        <w:rPr>
+          <w:sz w:val="2"/>
+        </w:rPr>
         <w:sectPr>
           <w:headerReference w:type="default" r:id="rId8"/>
           <w:pgSz w:w="11906" w:h="16838"/>
@@ -4784,7 +4764,7 @@
         <w:pStyle w:val="Ttulo1"/>
         <w:pageBreakBefore w:val="0"/>
       </w:pPr>
-      <w:bookmarkStart w:id="0" w:name="_Toc243324547"/>
+      <w:bookmarkStart w:id="0" w:name="_Toc243343598"/>
       <w:r>
         <w:lastRenderedPageBreak/>
         <w:t>1 INTRODUÇÃO</w:t>
@@ -4931,7 +4911,7 @@
       <w:pPr>
         <w:pStyle w:val="Ttulo1"/>
       </w:pPr>
-      <w:bookmarkStart w:id="1" w:name="_Toc243324548"/>
+      <w:bookmarkStart w:id="1" w:name="_Toc243343599"/>
       <w:r>
         <w:lastRenderedPageBreak/>
         <w:t>2 FUNDAMENTOS TEÓRICOS</w:t>
@@ -4960,7 +4940,7 @@
       <w:pPr>
         <w:pStyle w:val="Ttulo2"/>
       </w:pPr>
-      <w:bookmarkStart w:id="2" w:name="_Toc243324549"/>
+      <w:bookmarkStart w:id="2" w:name="_Toc243343600"/>
       <w:r>
         <w:t>2.1 RISCO, RETORNO E ÍNDICE DE SHARPE</w:t>
       </w:r>
@@ -4985,7 +4965,7 @@
       <w:pPr>
         <w:pStyle w:val="Ttulo2"/>
       </w:pPr>
-      <w:bookmarkStart w:id="3" w:name="_Toc243324550"/>
+      <w:bookmarkStart w:id="3" w:name="_Toc243343601"/>
       <w:r>
         <w:lastRenderedPageBreak/>
         <w:t>2.2 FACTOR INVESTING</w:t>
@@ -5043,7 +5023,7 @@
       <w:pPr>
         <w:pStyle w:val="Ttulo2"/>
       </w:pPr>
-      <w:bookmarkStart w:id="4" w:name="_Toc243324551"/>
+      <w:bookmarkStart w:id="4" w:name="_Toc243343602"/>
       <w:r>
         <w:lastRenderedPageBreak/>
         <w:t>2.3 ESG E DESEMPENHO FINANCEIRO</w:t>
@@ -5083,7 +5063,7 @@
       <w:pPr>
         <w:pStyle w:val="Ttulo2"/>
       </w:pPr>
-      <w:bookmarkStart w:id="5" w:name="_Toc243324552"/>
+      <w:bookmarkStart w:id="5" w:name="_Toc243343603"/>
       <w:r>
         <w:t>2.4 O ISE B3 E O IBrX</w:t>
       </w:r>
@@ -5110,7 +5090,7 @@
       <w:pPr>
         <w:pStyle w:val="LegendaABNT"/>
       </w:pPr>
-      <w:bookmarkStart w:id="6" w:name="_Toc243324590"/>
+      <w:bookmarkStart w:id="6" w:name="_Toc243343641"/>
       <w:r>
         <w:t xml:space="preserve">Quadro </w:t>
       </w:r>
@@ -5827,7 +5807,7 @@
       <w:pPr>
         <w:pStyle w:val="Ttulo2"/>
       </w:pPr>
-      <w:bookmarkStart w:id="7" w:name="_Toc243324553"/>
+      <w:bookmarkStart w:id="7" w:name="_Toc243343604"/>
       <w:r>
         <w:t>2.5 ESTUDOS NO BRASIL</w:t>
       </w:r>
@@ -5877,7 +5857,7 @@
       <w:pPr>
         <w:pStyle w:val="Ttulo1"/>
       </w:pPr>
-      <w:bookmarkStart w:id="8" w:name="_Toc243324554"/>
+      <w:bookmarkStart w:id="8" w:name="_Toc243343605"/>
       <w:r>
         <w:lastRenderedPageBreak/>
         <w:t>3 METODOLOGIA</w:t>
@@ -5893,7 +5873,7 @@
       <w:pPr>
         <w:pStyle w:val="Ttulo2"/>
       </w:pPr>
-      <w:bookmarkStart w:id="9" w:name="_Toc243324555"/>
+      <w:bookmarkStart w:id="9" w:name="_Toc243343606"/>
       <w:r>
         <w:t>3.1 TIPO DE PESQUISA</w:t>
       </w:r>
@@ -5931,7 +5911,7 @@
       <w:pPr>
         <w:pStyle w:val="Ttulo2"/>
       </w:pPr>
-      <w:bookmarkStart w:id="10" w:name="_Toc243324556"/>
+      <w:bookmarkStart w:id="10" w:name="_Toc243343607"/>
       <w:r>
         <w:t>3.2 PERÍODO E DADOS</w:t>
       </w:r>
@@ -5978,7 +5958,7 @@
       <w:pPr>
         <w:pStyle w:val="Ttulo2"/>
       </w:pPr>
-      <w:bookmarkStart w:id="11" w:name="_Toc243324557"/>
+      <w:bookmarkStart w:id="11" w:name="_Toc243343608"/>
       <w:r>
         <w:t>3.3 COMO OS FATORES SÃO MEDIDOS</w:t>
       </w:r>
@@ -5993,7 +5973,7 @@
       <w:pPr>
         <w:pStyle w:val="LegendaABNT"/>
       </w:pPr>
-      <w:bookmarkStart w:id="12" w:name="_Toc243324591"/>
+      <w:bookmarkStart w:id="12" w:name="_Toc243343642"/>
       <w:r>
         <w:t xml:space="preserve">Quadro </w:t>
       </w:r>
@@ -7301,7 +7281,7 @@
       <w:pPr>
         <w:pStyle w:val="Ttulo2"/>
       </w:pPr>
-      <w:bookmarkStart w:id="13" w:name="_Toc243324558"/>
+      <w:bookmarkStart w:id="13" w:name="_Toc243343609"/>
       <w:r>
         <w:lastRenderedPageBreak/>
         <w:t>3.4 AS CARTEIRAS</w:t>
@@ -7317,7 +7297,7 @@
       <w:pPr>
         <w:pStyle w:val="LegendaABNT"/>
       </w:pPr>
-      <w:bookmarkStart w:id="14" w:name="_Toc243324592"/>
+      <w:bookmarkStart w:id="14" w:name="_Toc243343643"/>
       <w:r>
         <w:t xml:space="preserve">Quadro </w:t>
       </w:r>
@@ -8492,7 +8472,7 @@
       <w:pPr>
         <w:pStyle w:val="LegendaABNT"/>
       </w:pPr>
-      <w:bookmarkStart w:id="15" w:name="_Toc243324593"/>
+      <w:bookmarkStart w:id="15" w:name="_Toc243343644"/>
       <w:r>
         <w:t xml:space="preserve">Quadro </w:t>
       </w:r>
@@ -9135,7 +9115,7 @@
       <w:pPr>
         <w:pStyle w:val="Ttulo2"/>
       </w:pPr>
-      <w:bookmarkStart w:id="16" w:name="_Toc243324559"/>
+      <w:bookmarkStart w:id="16" w:name="_Toc243343610"/>
       <w:r>
         <w:lastRenderedPageBreak/>
         <w:t>3.5 COMO A SIMULAÇÃO FUNCIONA</w:t>
@@ -9161,7 +9141,7 @@
       <w:pPr>
         <w:pStyle w:val="Ttulo2"/>
       </w:pPr>
-      <w:bookmarkStart w:id="17" w:name="_Toc243324560"/>
+      <w:bookmarkStart w:id="17" w:name="_Toc243343611"/>
       <w:r>
         <w:lastRenderedPageBreak/>
         <w:t>3.6 MEDIDAS DE DESEMPENHO E COMPARAÇÕES</w:t>
@@ -9752,7 +9732,7 @@
       <w:pPr>
         <w:pStyle w:val="Ttulo1"/>
       </w:pPr>
-      <w:bookmarkStart w:id="18" w:name="_Toc243324561"/>
+      <w:bookmarkStart w:id="18" w:name="_Toc243343612"/>
       <w:r>
         <w:lastRenderedPageBreak/>
         <w:t>4 RESULTADOS</w:t>
@@ -9768,7 +9748,7 @@
       <w:pPr>
         <w:pStyle w:val="Ttulo2"/>
       </w:pPr>
-      <w:bookmarkStart w:id="19" w:name="_Toc243324562"/>
+      <w:bookmarkStart w:id="19" w:name="_Toc243343613"/>
       <w:r>
         <w:t>4.1 AS CARTEIRAS AO LONGO DOS ANOS</w:t>
       </w:r>
@@ -9783,7 +9763,7 @@
       <w:pPr>
         <w:pStyle w:val="LegendaABNT"/>
       </w:pPr>
-      <w:bookmarkStart w:id="20" w:name="_Toc243324581"/>
+      <w:bookmarkStart w:id="20" w:name="_Toc243343632"/>
       <w:r>
         <w:t xml:space="preserve">Tabela </w:t>
       </w:r>
@@ -10844,7 +10824,7 @@
       <w:pPr>
         <w:pStyle w:val="Ttulo2"/>
       </w:pPr>
-      <w:bookmarkStart w:id="21" w:name="_Toc243324563"/>
+      <w:bookmarkStart w:id="21" w:name="_Toc243343614"/>
       <w:r>
         <w:t>4.2 DESEMPENHO NO PERÍODO INTEIRO</w:t>
       </w:r>
@@ -10871,7 +10851,7 @@
       <w:pPr>
         <w:pStyle w:val="LegendaABNT"/>
       </w:pPr>
-      <w:bookmarkStart w:id="22" w:name="_Toc243324582"/>
+      <w:bookmarkStart w:id="22" w:name="_Toc243343633"/>
       <w:r>
         <w:t xml:space="preserve">Tabela </w:t>
       </w:r>
@@ -12242,7 +12222,7 @@
       <w:pPr>
         <w:pStyle w:val="LegendaABNT"/>
       </w:pPr>
-      <w:bookmarkStart w:id="23" w:name="_Toc243324578"/>
+      <w:bookmarkStart w:id="23" w:name="_Toc243343629"/>
       <w:r>
         <w:t xml:space="preserve">Gráfico </w:t>
       </w:r>
@@ -12278,7 +12258,7 @@
           <w:noProof/>
         </w:rPr>
         <w:drawing>
-          <wp:inline distT="0" distB="0" distL="0" distR="0" wp14:anchorId="2679B9A5" wp14:editId="26D3BB4C">
+          <wp:inline distT="0" distB="0" distL="0" distR="0" wp14:anchorId="11D3032E" wp14:editId="672DC211">
             <wp:extent cx="5760000" cy="2990907"/>
             <wp:effectExtent l="0" t="0" r="0" b="0"/>
             <wp:docPr id="1" name="Picture 1"/>
@@ -12326,7 +12306,7 @@
       <w:pPr>
         <w:pStyle w:val="Ttulo2"/>
       </w:pPr>
-      <w:bookmarkStart w:id="24" w:name="_Toc243324564"/>
+      <w:bookmarkStart w:id="24" w:name="_Toc243343615"/>
       <w:r>
         <w:t>4.3 RETORNO DE CADA ANO</w:t>
       </w:r>
@@ -12361,7 +12341,7 @@
       <w:pPr>
         <w:pStyle w:val="LegendaABNT"/>
       </w:pPr>
-      <w:bookmarkStart w:id="25" w:name="_Toc243324583"/>
+      <w:bookmarkStart w:id="25" w:name="_Toc243343634"/>
       <w:r>
         <w:t xml:space="preserve">Tabela </w:t>
       </w:r>
@@ -13947,7 +13927,7 @@
       <w:pPr>
         <w:pStyle w:val="Ttulo2"/>
       </w:pPr>
-      <w:bookmarkStart w:id="26" w:name="_Toc243324565"/>
+      <w:bookmarkStart w:id="26" w:name="_Toc243343616"/>
       <w:r>
         <w:t>4.4 COMPORTAMENTO NAS QUEDAS FORTES DO MERCADO</w:t>
       </w:r>
@@ -13966,7 +13946,7 @@
       <w:pPr>
         <w:pStyle w:val="LegendaABNT"/>
       </w:pPr>
-      <w:bookmarkStart w:id="27" w:name="_Toc243324579"/>
+      <w:bookmarkStart w:id="27" w:name="_Toc243343630"/>
       <w:r>
         <w:lastRenderedPageBreak/>
         <w:t xml:space="preserve">Gráfico </w:t>
@@ -14003,7 +13983,7 @@
           <w:noProof/>
         </w:rPr>
         <w:drawing>
-          <wp:inline distT="0" distB="0" distL="0" distR="0" wp14:anchorId="23C5099C" wp14:editId="590E6596">
+          <wp:inline distT="0" distB="0" distL="0" distR="0" wp14:anchorId="617AF584" wp14:editId="4529C602">
             <wp:extent cx="5760000" cy="2739950"/>
             <wp:effectExtent l="0" t="0" r="0" b="0"/>
             <wp:docPr id="2" name="Picture 2"/>
@@ -14072,7 +14052,7 @@
       <w:pPr>
         <w:pStyle w:val="LegendaABNT"/>
       </w:pPr>
-      <w:bookmarkStart w:id="28" w:name="_Toc243324584"/>
+      <w:bookmarkStart w:id="28" w:name="_Toc243343635"/>
       <w:r>
         <w:t xml:space="preserve">Tabela </w:t>
       </w:r>
@@ -15098,7 +15078,7 @@
       <w:pPr>
         <w:pStyle w:val="Ttulo2"/>
       </w:pPr>
-      <w:bookmarkStart w:id="29" w:name="_Toc243324566"/>
+      <w:bookmarkStart w:id="29" w:name="_Toc243343617"/>
       <w:r>
         <w:t>4.5 CONCENTRAÇÃO EM SETORES</w:t>
       </w:r>
@@ -15113,7 +15093,7 @@
       <w:pPr>
         <w:pStyle w:val="LegendaABNT"/>
       </w:pPr>
-      <w:bookmarkStart w:id="30" w:name="_Toc243324585"/>
+      <w:bookmarkStart w:id="30" w:name="_Toc243343636"/>
       <w:r>
         <w:t xml:space="preserve">Tabela </w:t>
       </w:r>
@@ -15654,7 +15634,7 @@
       <w:pPr>
         <w:pStyle w:val="Ttulo2"/>
       </w:pPr>
-      <w:bookmarkStart w:id="31" w:name="_Toc243324567"/>
+      <w:bookmarkStart w:id="31" w:name="_Toc243343618"/>
       <w:r>
         <w:t>4.6 O PAPEL DA REGRA DE PESO DO ISE B3</w:t>
       </w:r>
@@ -15677,7 +15657,7 @@
       <w:pPr>
         <w:pStyle w:val="LegendaABNT"/>
       </w:pPr>
-      <w:bookmarkStart w:id="32" w:name="_Toc243324580"/>
+      <w:bookmarkStart w:id="32" w:name="_Toc243343631"/>
       <w:r>
         <w:t xml:space="preserve">Gráfico </w:t>
       </w:r>
@@ -15717,7 +15697,7 @@
           <w:noProof/>
         </w:rPr>
         <w:drawing>
-          <wp:inline distT="0" distB="0" distL="0" distR="0" wp14:anchorId="185C0303" wp14:editId="1CEC4390">
+          <wp:inline distT="0" distB="0" distL="0" distR="0" wp14:anchorId="6E9E1AA2" wp14:editId="4270A5DF">
             <wp:extent cx="5760000" cy="2990907"/>
             <wp:effectExtent l="0" t="0" r="0" b="0"/>
             <wp:docPr id="3" name="Picture 3"/>
@@ -15774,7 +15754,7 @@
       <w:pPr>
         <w:pStyle w:val="Ttulo2"/>
       </w:pPr>
-      <w:bookmarkStart w:id="33" w:name="_Toc243324568"/>
+      <w:bookmarkStart w:id="33" w:name="_Toc243343619"/>
       <w:r>
         <w:t>4.7 EFEITO DO CUSTO DE NEGOCIAÇÃO</w:t>
       </w:r>
@@ -15793,7 +15773,7 @@
       <w:pPr>
         <w:pStyle w:val="LegendaABNT"/>
       </w:pPr>
-      <w:bookmarkStart w:id="34" w:name="_Toc243324586"/>
+      <w:bookmarkStart w:id="34" w:name="_Toc243343637"/>
       <w:r>
         <w:lastRenderedPageBreak/>
         <w:t xml:space="preserve">Tabela </w:t>
@@ -16603,7 +16583,7 @@
       <w:pPr>
         <w:pStyle w:val="Ttulo1"/>
       </w:pPr>
-      <w:bookmarkStart w:id="35" w:name="_Toc243324569"/>
+      <w:bookmarkStart w:id="35" w:name="_Toc243343620"/>
       <w:r>
         <w:lastRenderedPageBreak/>
         <w:t>5 DISCUSSÃO</w:t>
@@ -16619,7 +16599,7 @@
       <w:pPr>
         <w:pStyle w:val="Ttulo2"/>
       </w:pPr>
-      <w:bookmarkStart w:id="36" w:name="_Toc243324570"/>
+      <w:bookmarkStart w:id="36" w:name="_Toc243343621"/>
       <w:r>
         <w:t>5.1 O CUSTO DE INVESTIR SÓ EM EMPRESAS SUSTENTÁVEIS</w:t>
       </w:r>
@@ -16694,7 +16674,7 @@
       <w:pPr>
         <w:pStyle w:val="LegendaABNT"/>
       </w:pPr>
-      <w:bookmarkStart w:id="37" w:name="_Toc243324587"/>
+      <w:bookmarkStart w:id="37" w:name="_Toc243343638"/>
       <w:r>
         <w:t xml:space="preserve">Tabela </w:t>
       </w:r>
@@ -17167,7 +17147,7 @@
       <w:pPr>
         <w:pStyle w:val="Ttulo2"/>
       </w:pPr>
-      <w:bookmarkStart w:id="38" w:name="_Toc243324571"/>
+      <w:bookmarkStart w:id="38" w:name="_Toc243343622"/>
       <w:r>
         <w:t>5.2 POR QUE O ÍNDICE ISE B3 RENDEU POUCO</w:t>
       </w:r>
@@ -17212,7 +17192,7 @@
       <w:pPr>
         <w:pStyle w:val="Ttulo2"/>
       </w:pPr>
-      <w:bookmarkStart w:id="39" w:name="_Toc243324572"/>
+      <w:bookmarkStart w:id="39" w:name="_Toc243343623"/>
       <w:r>
         <w:t>5.3 O QUE AS QUEDAS FORTES MOSTRAM</w:t>
       </w:r>
@@ -17256,7 +17236,7 @@
       <w:pPr>
         <w:pStyle w:val="LegendaABNT"/>
       </w:pPr>
-      <w:bookmarkStart w:id="40" w:name="_Toc243324588"/>
+      <w:bookmarkStart w:id="40" w:name="_Toc243343639"/>
       <w:r>
         <w:t xml:space="preserve">Tabela </w:t>
       </w:r>
@@ -17987,7 +17967,7 @@
       <w:pPr>
         <w:pStyle w:val="LegendaABNT"/>
       </w:pPr>
-      <w:bookmarkStart w:id="41" w:name="_Toc243324589"/>
+      <w:bookmarkStart w:id="41" w:name="_Toc243343640"/>
       <w:r>
         <w:lastRenderedPageBreak/>
         <w:t xml:space="preserve">Tabela </w:t>
@@ -18632,7 +18612,7 @@
       <w:pPr>
         <w:pStyle w:val="Ttulo2"/>
       </w:pPr>
-      <w:bookmarkStart w:id="42" w:name="_Toc243324573"/>
+      <w:bookmarkStart w:id="42" w:name="_Toc243343624"/>
       <w:r>
         <w:t>5.4 OS FATORES E A FORMA DE COMBINÁ-LOS</w:t>
       </w:r>
@@ -18727,7 +18707,7 @@
       <w:pPr>
         <w:pStyle w:val="Ttulo2"/>
       </w:pPr>
-      <w:bookmarkStart w:id="43" w:name="_Toc243324574"/>
+      <w:bookmarkStart w:id="43" w:name="_Toc243343625"/>
       <w:r>
         <w:t>5.5 A CONCENTRAÇÃO EM ENERGIA</w:t>
       </w:r>
@@ -18751,7 +18731,7 @@
       <w:pPr>
         <w:pStyle w:val="Ttulo1"/>
       </w:pPr>
-      <w:bookmarkStart w:id="44" w:name="_Toc243324575"/>
+      <w:bookmarkStart w:id="44" w:name="_Toc243343626"/>
       <w:r>
         <w:lastRenderedPageBreak/>
         <w:t>6 CONCLUSÃO</w:t>
@@ -18915,7 +18895,7 @@
         <w:pageBreakBefore/>
         <w:outlineLvl w:val="0"/>
       </w:pPr>
-      <w:bookmarkStart w:id="45" w:name="_Toc243324576"/>
+      <w:bookmarkStart w:id="45" w:name="_Toc243343627"/>
       <w:r>
         <w:lastRenderedPageBreak/>
         <w:t>REFERÊNCIAS</w:t>
@@ -19491,7 +19471,7 @@
         <w:pageBreakBefore/>
         <w:outlineLvl w:val="0"/>
       </w:pPr>
-      <w:bookmarkStart w:id="46" w:name="_Toc243324577"/>
+      <w:bookmarkStart w:id="46" w:name="_Toc243343628"/>
       <w:r>
         <w:lastRenderedPageBreak/>
         <w:t>APÊNDICE A – AÇÕES DE CADA CARTEIRA, ANO A ANO</w:t>
@@ -19507,7 +19487,7 @@
       <w:pPr>
         <w:pStyle w:val="LegendaABNT"/>
       </w:pPr>
-      <w:bookmarkStart w:id="47" w:name="_Toc243324594"/>
+      <w:bookmarkStart w:id="47" w:name="_Toc243343645"/>
       <w:r>
         <w:t xml:space="preserve">Quadro </w:t>
       </w:r>
@@ -20349,7 +20329,7 @@
       <w:pPr>
         <w:pStyle w:val="LegendaABNT"/>
       </w:pPr>
-      <w:bookmarkStart w:id="48" w:name="_Toc243324595"/>
+      <w:bookmarkStart w:id="48" w:name="_Toc243343646"/>
       <w:r>
         <w:lastRenderedPageBreak/>
         <w:t xml:space="preserve">Quadro </w:t>
@@ -21192,7 +21172,7 @@
       <w:pPr>
         <w:pStyle w:val="LegendaABNT"/>
       </w:pPr>
-      <w:bookmarkStart w:id="49" w:name="_Toc243324596"/>
+      <w:bookmarkStart w:id="49" w:name="_Toc243343647"/>
       <w:r>
         <w:lastRenderedPageBreak/>
         <w:t xml:space="preserve">Quadro </w:t>
@@ -22035,7 +22015,7 @@
       <w:pPr>
         <w:pStyle w:val="LegendaABNT"/>
       </w:pPr>
-      <w:bookmarkStart w:id="50" w:name="_Toc243324597"/>
+      <w:bookmarkStart w:id="50" w:name="_Toc243343648"/>
       <w:r>
         <w:t xml:space="preserve">Quadro </w:t>
       </w:r>
@@ -22877,7 +22857,7 @@
       <w:pPr>
         <w:pStyle w:val="LegendaABNT"/>
       </w:pPr>
-      <w:bookmarkStart w:id="51" w:name="_Toc243324598"/>
+      <w:bookmarkStart w:id="51" w:name="_Toc243343649"/>
       <w:r>
         <w:lastRenderedPageBreak/>
         <w:t xml:space="preserve">Quadro </w:t>
@@ -23729,7 +23709,7 @@
       <w:pPr>
         <w:pStyle w:val="LegendaABNT"/>
       </w:pPr>
-      <w:bookmarkStart w:id="52" w:name="_Toc243324599"/>
+      <w:bookmarkStart w:id="52" w:name="_Toc243343650"/>
       <w:r>
         <w:t xml:space="preserve">Quadro </w:t>
       </w:r>
@@ -24856,31 +24836,31 @@
       </w:rPr>
     </w:lvl>
   </w:abstractNum>
-  <w:num w:numId="1" w16cid:durableId="1868981045">
+  <w:num w:numId="1" w16cid:durableId="306865885">
     <w:abstractNumId w:val="8"/>
   </w:num>
-  <w:num w:numId="2" w16cid:durableId="1461681807">
+  <w:num w:numId="2" w16cid:durableId="1437751782">
     <w:abstractNumId w:val="6"/>
   </w:num>
-  <w:num w:numId="3" w16cid:durableId="1227571198">
+  <w:num w:numId="3" w16cid:durableId="855850890">
     <w:abstractNumId w:val="5"/>
   </w:num>
-  <w:num w:numId="4" w16cid:durableId="420227466">
+  <w:num w:numId="4" w16cid:durableId="1977182546">
     <w:abstractNumId w:val="4"/>
   </w:num>
-  <w:num w:numId="5" w16cid:durableId="1640528694">
+  <w:num w:numId="5" w16cid:durableId="1135685713">
     <w:abstractNumId w:val="7"/>
   </w:num>
-  <w:num w:numId="6" w16cid:durableId="443621264">
+  <w:num w:numId="6" w16cid:durableId="1067414532">
     <w:abstractNumId w:val="3"/>
   </w:num>
-  <w:num w:numId="7" w16cid:durableId="1056271197">
+  <w:num w:numId="7" w16cid:durableId="1382439942">
     <w:abstractNumId w:val="2"/>
   </w:num>
-  <w:num w:numId="8" w16cid:durableId="806626084">
+  <w:num w:numId="8" w16cid:durableId="1401907686">
     <w:abstractNumId w:val="1"/>
   </w:num>
-  <w:num w:numId="9" w16cid:durableId="1153569019">
+  <w:num w:numId="9" w16cid:durableId="1501433305">
     <w:abstractNumId w:val="0"/>
   </w:num>
 </w:numbering>
@@ -36378,6 +36358,25 @@
       <w:b/>
     </w:rPr>
   </w:style>
+  <w:style w:type="paragraph" w:styleId="ndicedeilustraes">
+    <w:name w:val="table of figures"/>
+    <w:basedOn w:val="Normal"/>
+    <w:next w:val="Normal"/>
+    <w:uiPriority w:val="99"/>
+    <w:unhideWhenUsed/>
+    <w:rsid w:val="005E1E60"/>
+  </w:style>
+  <w:style w:type="character" w:styleId="Hyperlink">
+    <w:name w:val="Hyperlink"/>
+    <w:basedOn w:val="Fontepargpadro"/>
+    <w:uiPriority w:val="99"/>
+    <w:unhideWhenUsed/>
+    <w:rsid w:val="005E1E60"/>
+    <w:rPr>
+      <w:color w:val="0000FF" w:themeColor="hyperlink"/>
+      <w:u w:val="single"/>
+    </w:rPr>
+  </w:style>
   <w:style w:type="paragraph" w:styleId="Sumrio1">
     <w:name w:val="toc 1"/>
     <w:basedOn w:val="Normal"/>
@@ -36385,7 +36384,7 @@
     <w:autoRedefine/>
     <w:uiPriority w:val="39"/>
     <w:unhideWhenUsed/>
-    <w:rsid w:val="00041E36"/>
+    <w:rsid w:val="005E1E60"/>
     <w:pPr>
       <w:spacing w:after="100"/>
     </w:pPr>
@@ -36397,30 +36396,11 @@
     <w:autoRedefine/>
     <w:uiPriority w:val="39"/>
     <w:unhideWhenUsed/>
-    <w:rsid w:val="00041E36"/>
+    <w:rsid w:val="005E1E60"/>
     <w:pPr>
       <w:spacing w:after="100"/>
       <w:ind w:left="240"/>
     </w:pPr>
-  </w:style>
-  <w:style w:type="character" w:styleId="Hyperlink">
-    <w:name w:val="Hyperlink"/>
-    <w:basedOn w:val="Fontepargpadro"/>
-    <w:uiPriority w:val="99"/>
-    <w:unhideWhenUsed/>
-    <w:rsid w:val="00041E36"/>
-    <w:rPr>
-      <w:color w:val="0000FF" w:themeColor="hyperlink"/>
-      <w:u w:val="single"/>
-    </w:rPr>
-  </w:style>
-  <w:style w:type="paragraph" w:styleId="ndicedeilustraes">
-    <w:name w:val="table of figures"/>
-    <w:basedOn w:val="Normal"/>
-    <w:next w:val="Normal"/>
-    <w:uiPriority w:val="99"/>
-    <w:unhideWhenUsed/>
-    <w:rsid w:val="00041E36"/>
   </w:style>
 </w:styles>
 </file>

</xml_diff>